<commit_message>
adding editor and admin only option
</commit_message>
<xml_diff>
--- a/docs/PulseWatch-Admin-Guide.docx
+++ b/docs/PulseWatch-Admin-Guide.docx
@@ -6047,6 +6047,26 @@
       </w:pPr>
       <w:r>
         <w:t xml:space="preserve">An empty field means no restriction. Providers with a list show the "Group" badge in the overview.</w:t>
+      </w:r>
+    </w:p>
+    <w:p>
+      <w:pPr>
+        <w:pStyle w:val="ListParagraph"/>
+        <w:numPr>
+          <w:ilvl w:val="0"/>
+          <w:numId w:val="4"/>
+        </w:numPr>
+        <w:spacing w:after="60" w:line="288"/>
+      </w:pPr>
+      <w:r>
+        <w:rPr>
+          <w:b/>
+          <w:bCs/>
+        </w:rPr>
+        <w:t xml:space="preserve">Editors and admins only:</w:t>
+      </w:r>
+      <w:r>
+        <w:t xml:space="preserve"> The "Editors and admins only" switch lets in only members of the admin or editor groups. Anyone who would only become a viewer is turned away as described above, even if they are in an "Allowed group". This requires admin/editor groups to be set on the provider, otherwise nobody can sign in through SSO (local accounts keep working). With the default role "Editor" the switch has no effect.</w:t>
       </w:r>
     </w:p>
     <w:p>

</xml_diff>